<commit_message>
Use SWP-2xx document numbers in place of HM-PRC-VXX-PRO2xx in all SWPs
Co-Authored-By: Claude Opus 5.5 <noreply@anthropic.com>
Claude-Session: https://claude.ai/code/session_01UHnSDEBA56GANs2gfXuK2P
</commit_message>
<xml_diff>
--- a/SWP/SWP-206-Metallurgical-Accounting-and-Reconciliation-RevA.docx
+++ b/SWP/SWP-206-Metallurgical-Accounting-and-Reconciliation-RevA.docx
@@ -122,7 +122,7 @@
               <w:sz w:val="32"/>
               <w:szCs w:val="32"/>
             </w:rPr>
-            <w:t xml:space="preserve">HM-PRC-VXX-PRO206</w:t>
+            <w:t xml:space="preserve">SWP-206</w:t>
           </w:r>
         </w:p>
         <w:p>
@@ -403,7 +403,7 @@
                     <w:sz w:val="20"/>
                     <w:szCs w:val="20"/>
                   </w:rPr>
-                  <w:t xml:space="preserve">HM-PRC-VXX-PRO206</w:t>
+                  <w:t xml:space="preserve">SWP-206</w:t>
                 </w:r>
                 <w:r>
                   <w:rPr>
@@ -7105,7 +7105,7 @@
               <w:sz w:val="20"/>
               <w:szCs w:val="20"/>
             </w:rPr>
-            <w:t xml:space="preserve">HM-PRC-VXX-PRO206_Metallurgical Accounting and Reconciliation</w:t>
+            <w:t xml:space="preserve">SWP-206_Metallurgical Accounting and Reconciliation</w:t>
           </w:r>
           <w:r>
             <w:rPr>
@@ -7688,7 +7688,7 @@
         <w:sz w:val="18"/>
         <w:szCs w:val="20"/>
       </w:rPr>
-      <w:t xml:space="preserve">HM-PRC-VXX-PRO206</w:t>
+      <w:t xml:space="preserve">SWP-206</w:t>
     </w:r>
   </w:p>
 </w:hdr>

</xml_diff>